<commit_message>
new participant YTM doc, update check-form. Hungry lets get a sandwich
</commit_message>
<xml_diff>
--- a/docs/research_muziek/spotify_features.docx
+++ b/docs/research_muziek/spotify_features.docx
@@ -45,19 +45,176 @@
         <w:pStyle w:val="NoSpacing"/>
       </w:pPr>
       <w:r>
-        <w:t xml:space="preserve">Calm: High </w:t>
-      </w:r>
+        <w:t>For all tracks: no preference</w:t>
+      </w:r>
+    </w:p>
+    <w:p>
+      <w:pPr>
+        <w:pStyle w:val="NoSpacing"/>
+      </w:pPr>
+    </w:p>
+    <w:p>
+      <w:pPr>
+        <w:pStyle w:val="NoSpacing"/>
+      </w:pPr>
+    </w:p>
+    <w:p>
+      <w:pPr>
+        <w:rPr>
+          <w:rStyle w:val="Strong"/>
+        </w:rPr>
+      </w:pPr>
+      <w:r>
+        <w:rPr>
+          <w:rStyle w:val="Strong"/>
+        </w:rPr>
+        <w:t>Danceability</w:t>
+      </w:r>
+    </w:p>
+    <w:p>
+      <w:r>
+        <w:t xml:space="preserve">number [float] </w:t>
+      </w:r>
+    </w:p>
+    <w:p>
+      <w:r>
+        <w:t>Danceability describes how suitable a track is for dancing based on a combination of musical elements including tempo, rhythm stability, beat strength, and overall regularity. A value of 0.0 is least danceable and 1.0 is most danceable.</w:t>
+      </w:r>
+    </w:p>
+    <w:p>
+      <w:pPr>
+        <w:pStyle w:val="NoSpacing"/>
+      </w:pPr>
+      <w:r>
+        <w:t>Calm: High value – combo low value Tempo</w:t>
+      </w:r>
+    </w:p>
+    <w:p>
+      <w:pPr>
+        <w:pStyle w:val="NoSpacing"/>
+      </w:pPr>
+      <w:r>
+        <w:t>Neutral: middle values in combo with middle values Tempo</w:t>
+      </w:r>
+    </w:p>
+    <w:p>
+      <w:pPr>
+        <w:pStyle w:val="NoSpacing"/>
+      </w:pPr>
+      <w:r>
+        <w:t>Energy: High</w:t>
+      </w:r>
+      <w:r>
+        <w:t>er range</w:t>
+      </w:r>
+      <w:r>
+        <w:t xml:space="preserve"> – combo high value Tempo</w:t>
+      </w:r>
+    </w:p>
+    <w:p/>
+    <w:p>
+      <w:pPr>
+        <w:rPr>
+          <w:rStyle w:val="Strong"/>
+        </w:rPr>
+      </w:pPr>
       <w:proofErr w:type="spellStart"/>
       <w:r>
-        <w:t>acousticness</w:t>
+        <w:rPr>
+          <w:rStyle w:val="Strong"/>
+        </w:rPr>
+        <w:t>Duration_ms</w:t>
       </w:r>
       <w:proofErr w:type="spellEnd"/>
     </w:p>
     <w:p>
+      <w:r>
+        <w:t>number [</w:t>
+      </w:r>
+      <w:r>
+        <w:t>integer</w:t>
+      </w:r>
+      <w:r>
+        <w:t>]</w:t>
+      </w:r>
+      <w:r>
+        <w:t xml:space="preserve"> </w:t>
+      </w:r>
+    </w:p>
+    <w:p>
+      <w:r>
+        <w:t>The duration of the track in milliseconds.</w:t>
+      </w:r>
+    </w:p>
+    <w:p>
+      <w:r>
+        <w:t xml:space="preserve">For all: set limits (not shorter </w:t>
+      </w:r>
+      <w:proofErr w:type="spellStart"/>
+      <w:r>
+        <w:t>then</w:t>
+      </w:r>
+      <w:proofErr w:type="spellEnd"/>
+      <w:r>
+        <w:t xml:space="preserve"> 1 min, </w:t>
+      </w:r>
+      <w:proofErr w:type="spellStart"/>
+      <w:r>
+        <w:t>not longer</w:t>
+      </w:r>
+      <w:proofErr w:type="spellEnd"/>
+      <w:r>
+        <w:t xml:space="preserve"> </w:t>
+      </w:r>
+      <w:proofErr w:type="spellStart"/>
+      <w:r>
+        <w:t>then</w:t>
+      </w:r>
+      <w:proofErr w:type="spellEnd"/>
+      <w:r>
+        <w:t xml:space="preserve"> 5 min)</w:t>
+      </w:r>
+    </w:p>
+    <w:p/>
+    <w:p>
+      <w:pPr>
+        <w:rPr>
+          <w:rStyle w:val="Strong"/>
+        </w:rPr>
+      </w:pPr>
+      <w:r>
+        <w:rPr>
+          <w:rStyle w:val="Strong"/>
+        </w:rPr>
+        <w:t>Energy</w:t>
+      </w:r>
+    </w:p>
+    <w:p>
+      <w:r>
+        <w:t>n</w:t>
+      </w:r>
+      <w:r>
+        <w:t xml:space="preserve">umber [float] </w:t>
+      </w:r>
+    </w:p>
+    <w:p>
+      <w:r>
+        <w:t>Energy is a measure from 0.0 to 1.0 and represents a perceptual measure of intensity and activity. Typically, energetic tracks feel fast, loud, and noisy. For example, death metal has high energy, while a Bach prelude scores low on the scale. Perceptual features contributing to this attribute include dynamic range, perceived loudness, timbre, onset rate, and general entropy.</w:t>
+      </w:r>
+    </w:p>
+    <w:p>
       <w:pPr>
         <w:pStyle w:val="NoSpacing"/>
       </w:pPr>
       <w:r>
+        <w:t>Calm: low values</w:t>
+      </w:r>
+    </w:p>
+    <w:p>
+      <w:pPr>
+        <w:pStyle w:val="NoSpacing"/>
+      </w:pPr>
+      <w:r>
         <w:t>Neutral: middle values</w:t>
       </w:r>
     </w:p>
@@ -66,7 +223,7 @@
         <w:pStyle w:val="NoSpacing"/>
       </w:pPr>
       <w:r>
-        <w:t>Energy: non acoustic</w:t>
+        <w:t>Energy: higher range</w:t>
       </w:r>
     </w:p>
     <w:p>
@@ -80,17 +237,14 @@
       </w:pPr>
     </w:p>
     <w:p>
-      <w:pPr>
+      <w:proofErr w:type="spellStart"/>
+      <w:r>
         <w:rPr>
           <w:rStyle w:val="Strong"/>
         </w:rPr>
-      </w:pPr>
-      <w:r>
-        <w:rPr>
-          <w:rStyle w:val="Strong"/>
-        </w:rPr>
-        <w:t>Danceability</w:t>
-      </w:r>
+        <w:t>Instrumentalness</w:t>
+      </w:r>
+      <w:proofErr w:type="spellEnd"/>
     </w:p>
     <w:p>
       <w:r>
@@ -99,7 +253,15 @@
     </w:p>
     <w:p>
       <w:r>
-        <w:t>Danceability describes how suitable a track is for dancing based on a combination of musical elements including tempo, rhythm stability, beat strength, and overall regularity. A value of 0.0 is least danceable and 1.0 is most danceable.</w:t>
+        <w:t xml:space="preserve">Predicts whether a track contains no vocals. "Ooh" and "aah" sounds are treated as instrumental in this context. Rap or spoken word tracks are clearly "vocal". The closer the </w:t>
+      </w:r>
+      <w:proofErr w:type="spellStart"/>
+      <w:r>
+        <w:t>instrumentalness</w:t>
+      </w:r>
+      <w:proofErr w:type="spellEnd"/>
+      <w:r>
+        <w:t xml:space="preserve"> value is to 1.0, the greater likelihood the track contains no vocal content. Values above 0.5 are intended to represent instrumental tracks, but confidence is higher as the value approaches 1.0.</w:t>
       </w:r>
     </w:p>
     <w:p>
@@ -107,185 +269,7 @@
         <w:pStyle w:val="NoSpacing"/>
       </w:pPr>
       <w:r>
-        <w:t>Calm: High value – combo low value Tempo</w:t>
-      </w:r>
-    </w:p>
-    <w:p>
-      <w:pPr>
-        <w:pStyle w:val="NoSpacing"/>
-      </w:pPr>
-      <w:r>
-        <w:t>Neutral: middle values in combo with middle values Tempo</w:t>
-      </w:r>
-    </w:p>
-    <w:p>
-      <w:pPr>
-        <w:pStyle w:val="NoSpacing"/>
-      </w:pPr>
-      <w:r>
-        <w:t>Energy: High</w:t>
-      </w:r>
-      <w:r>
-        <w:t>er range</w:t>
-      </w:r>
-      <w:r>
-        <w:t xml:space="preserve"> – combo high value Tempo</w:t>
-      </w:r>
-    </w:p>
-    <w:p/>
-    <w:p>
-      <w:pPr>
-        <w:rPr>
-          <w:rStyle w:val="Strong"/>
-        </w:rPr>
-      </w:pPr>
-      <w:proofErr w:type="spellStart"/>
-      <w:r>
-        <w:rPr>
-          <w:rStyle w:val="Strong"/>
-        </w:rPr>
-        <w:t>Duration_ms</w:t>
-      </w:r>
-      <w:proofErr w:type="spellEnd"/>
-    </w:p>
-    <w:p>
-      <w:r>
-        <w:t>number [</w:t>
-      </w:r>
-      <w:r>
-        <w:t>integer</w:t>
-      </w:r>
-      <w:r>
-        <w:t>]</w:t>
-      </w:r>
-      <w:r>
-        <w:t xml:space="preserve"> </w:t>
-      </w:r>
-    </w:p>
-    <w:p>
-      <w:r>
-        <w:t>The duration of the track in milliseconds.</w:t>
-      </w:r>
-    </w:p>
-    <w:p>
-      <w:r>
-        <w:t xml:space="preserve">For all: set limits (not shorter then 1 min, </w:t>
-      </w:r>
-      <w:proofErr w:type="spellStart"/>
-      <w:r>
-        <w:t>not longer</w:t>
-      </w:r>
-      <w:proofErr w:type="spellEnd"/>
-      <w:r>
-        <w:t xml:space="preserve"> </w:t>
-      </w:r>
-      <w:proofErr w:type="spellStart"/>
-      <w:r>
-        <w:t>then</w:t>
-      </w:r>
-      <w:proofErr w:type="spellEnd"/>
-      <w:r>
-        <w:t xml:space="preserve"> 5 min)</w:t>
-      </w:r>
-    </w:p>
-    <w:p/>
-    <w:p>
-      <w:pPr>
-        <w:rPr>
-          <w:rStyle w:val="Strong"/>
-        </w:rPr>
-      </w:pPr>
-      <w:r>
-        <w:rPr>
-          <w:rStyle w:val="Strong"/>
-        </w:rPr>
-        <w:t>Energy</w:t>
-      </w:r>
-    </w:p>
-    <w:p>
-      <w:r>
-        <w:t>n</w:t>
-      </w:r>
-      <w:r>
-        <w:t xml:space="preserve">umber [float] </w:t>
-      </w:r>
-    </w:p>
-    <w:p>
-      <w:r>
-        <w:t>Energy is a measure from 0.0 to 1.0 and represents a perceptual measure of intensity and activity. Typically, energetic tracks feel fast, loud, and noisy. For example, death metal has high energy, while a Bach prelude scores low on the scale. Perceptual features contributing to this attribute include dynamic range, perceived loudness, timbre, onset rate, and general entropy.</w:t>
-      </w:r>
-    </w:p>
-    <w:p>
-      <w:pPr>
-        <w:pStyle w:val="NoSpacing"/>
-      </w:pPr>
-      <w:r>
-        <w:t>Calm: low values</w:t>
-      </w:r>
-    </w:p>
-    <w:p>
-      <w:pPr>
-        <w:pStyle w:val="NoSpacing"/>
-      </w:pPr>
-      <w:r>
-        <w:t>Neutral: middle values</w:t>
-      </w:r>
-    </w:p>
-    <w:p>
-      <w:pPr>
-        <w:pStyle w:val="NoSpacing"/>
-      </w:pPr>
-      <w:r>
-        <w:t>Energy: higher range</w:t>
-      </w:r>
-    </w:p>
-    <w:p>
-      <w:pPr>
-        <w:pStyle w:val="NoSpacing"/>
-      </w:pPr>
-    </w:p>
-    <w:p>
-      <w:pPr>
-        <w:pStyle w:val="NoSpacing"/>
-      </w:pPr>
-    </w:p>
-    <w:p>
-      <w:proofErr w:type="spellStart"/>
-      <w:r>
-        <w:rPr>
-          <w:rStyle w:val="Strong"/>
-        </w:rPr>
-        <w:t>Instrumentalness</w:t>
-      </w:r>
-      <w:proofErr w:type="spellEnd"/>
-    </w:p>
-    <w:p>
-      <w:r>
-        <w:t xml:space="preserve">number [float] </w:t>
-      </w:r>
-    </w:p>
-    <w:p>
-      <w:r>
-        <w:t xml:space="preserve">Predicts whether a track contains no vocals. "Ooh" and "aah" sounds are treated as instrumental in this context. Rap or spoken word tracks are clearly "vocal". The closer the </w:t>
-      </w:r>
-      <w:proofErr w:type="spellStart"/>
-      <w:r>
-        <w:t>instrumentalness</w:t>
-      </w:r>
-      <w:proofErr w:type="spellEnd"/>
-      <w:r>
-        <w:t xml:space="preserve"> value is to 1.0, the greater likelihood the track contains no vocal content. </w:t>
-      </w:r>
-      <w:r>
         <w:lastRenderedPageBreak/>
-        <w:t>Values above 0.5 are intended to represent instrumental tracks, but confidence is higher as the value approaches 1.0.</w:t>
-      </w:r>
-    </w:p>
-    <w:p>
-      <w:pPr>
-        <w:pStyle w:val="NoSpacing"/>
-      </w:pPr>
-      <w:r>
         <w:t>For all tracks: no preference</w:t>
       </w:r>
     </w:p>
@@ -391,10 +375,7 @@
         <w:pStyle w:val="NoSpacing"/>
       </w:pPr>
       <w:r>
-        <w:t xml:space="preserve">For all tracks: </w:t>
-      </w:r>
-      <w:r>
-        <w:t>exclude live music – distraction/interaction of audio group feeling</w:t>
+        <w:t>For all tracks: exclude live music – distraction/interaction of audio group feeling</w:t>
       </w:r>
     </w:p>
     <w:p/>
@@ -486,10 +467,7 @@
         <w:pStyle w:val="NoSpacing"/>
       </w:pPr>
       <w:r>
-        <w:t xml:space="preserve">For all tracks: </w:t>
-      </w:r>
-      <w:r>
-        <w:t>look at danceability</w:t>
+        <w:t>For all tracks: look at danceability</w:t>
       </w:r>
     </w:p>
     <w:p/>
@@ -530,8 +508,41 @@
         <w:pStyle w:val="NoSpacing"/>
       </w:pPr>
       <w:r>
+        <w:t>Neutral: mixed bag but within limits, smooth transitions</w:t>
+      </w:r>
+    </w:p>
+    <w:p>
+      <w:pPr>
+        <w:pStyle w:val="NoSpacing"/>
+      </w:pPr>
+      <w:r>
+        <w:t>Energy: louder music, equal loudness throughout playlist (variance in song is encouraged)</w:t>
+      </w:r>
+    </w:p>
+    <w:p>
+      <w:pPr>
+        <w:rPr>
+          <w:rStyle w:val="Strong"/>
+        </w:rPr>
+      </w:pPr>
+    </w:p>
+    <w:p>
+      <w:r>
+        <w:rPr>
+          <w:rStyle w:val="Strong"/>
+        </w:rPr>
         <w:lastRenderedPageBreak/>
-        <w:t>Neutral: mixed bag but within limits, smooth transitions</w:t>
+        <w:t>Mode</w:t>
+      </w:r>
+    </w:p>
+    <w:p>
+      <w:r>
+        <w:t xml:space="preserve">integer </w:t>
+      </w:r>
+    </w:p>
+    <w:p>
+      <w:r>
+        <w:t>Mode indicates the modality (major or minor) of a track, the type of scale from which its melodic content is derived. Major is represented by 1 and minor is 0.</w:t>
       </w:r>
     </w:p>
     <w:p>
@@ -539,23 +550,66 @@
         <w:pStyle w:val="NoSpacing"/>
       </w:pPr>
       <w:r>
-        <w:t>Energy: louder music, equal loudness throughout playlist (variance in song is encouraged)</w:t>
-      </w:r>
-    </w:p>
-    <w:p>
-      <w:pPr>
+        <w:t>For all tracks: no preference</w:t>
+      </w:r>
+    </w:p>
+    <w:p/>
+    <w:p>
+      <w:proofErr w:type="spellStart"/>
+      <w:r>
         <w:rPr>
           <w:rStyle w:val="Strong"/>
         </w:rPr>
-      </w:pPr>
-    </w:p>
-    <w:p>
-      <w:r>
+        <w:t>Speechiness</w:t>
+      </w:r>
+      <w:proofErr w:type="spellEnd"/>
+    </w:p>
+    <w:p>
+      <w:r>
+        <w:t xml:space="preserve">number [float] </w:t>
+      </w:r>
+    </w:p>
+    <w:p>
+      <w:proofErr w:type="spellStart"/>
+      <w:r>
+        <w:t>Speechiness</w:t>
+      </w:r>
+      <w:proofErr w:type="spellEnd"/>
+      <w:r>
+        <w:t xml:space="preserve"> detects the presence of spoken words in a track. The more exclusively speech-like the recording (e.g. talk show, audio book, poetry), the closer to 1.0 the attribute value. Values above 0.66 describe tracks that are probably made entirely of spoken words. Values between 0.33 and 0.66 describe tracks that may contain both music and speech, either in sections or layered, including such cases as rap music. Values below 0.33 most likely represent music and other non-speech-like tracks.</w:t>
+      </w:r>
+    </w:p>
+    <w:p>
+      <w:pPr>
+        <w:pStyle w:val="NoSpacing"/>
+      </w:pPr>
+      <w:r>
+        <w:t xml:space="preserve">For all tracks: no preference, exclude entirely spoken </w:t>
+      </w:r>
+      <w:proofErr w:type="spellStart"/>
+      <w:r>
+        <w:t>audiofiles</w:t>
+      </w:r>
+      <w:proofErr w:type="spellEnd"/>
+      <w:r>
+        <w:t xml:space="preserve"> (no music)</w:t>
+      </w:r>
+    </w:p>
+    <w:p/>
+    <w:p>
+      <w:pPr>
         <w:rPr>
           <w:rStyle w:val="Strong"/>
         </w:rPr>
-        <w:t>Mode</w:t>
-      </w:r>
+      </w:pPr>
+      <w:proofErr w:type="spellStart"/>
+      <w:r>
+        <w:rPr>
+          <w:rStyle w:val="Strong"/>
+        </w:rPr>
+        <w:t>Time_signature</w:t>
+      </w:r>
+      <w:proofErr w:type="spellEnd"/>
     </w:p>
     <w:p>
       <w:r>
@@ -564,7 +618,7 @@
     </w:p>
     <w:p>
       <w:r>
-        <w:t>Mode indicates the modality (major or minor) of a track, the type of scale from which its melodic content is derived. Major is represented by 1 and minor is 0.</w:t>
+        <w:t>An estimated time signature. The time signature (meter) is a notational convention to specify how many beats are in each bar (or measure). The time signature ranges from 3 to 7 indicating time signatures of "3/4", to "7/4".</w:t>
       </w:r>
     </w:p>
     <w:p>
@@ -572,89 +626,7 @@
         <w:pStyle w:val="NoSpacing"/>
       </w:pPr>
       <w:r>
-        <w:t>For all tracks: no preference</w:t>
-      </w:r>
-    </w:p>
-    <w:p/>
-    <w:p>
-      <w:proofErr w:type="spellStart"/>
-      <w:r>
-        <w:rPr>
-          <w:rStyle w:val="Strong"/>
-        </w:rPr>
-        <w:t>Speechiness</w:t>
-      </w:r>
-      <w:proofErr w:type="spellEnd"/>
-    </w:p>
-    <w:p>
-      <w:r>
-        <w:t xml:space="preserve">number [float] </w:t>
-      </w:r>
-    </w:p>
-    <w:p>
-      <w:proofErr w:type="spellStart"/>
-      <w:r>
-        <w:t>Speechiness</w:t>
-      </w:r>
-      <w:proofErr w:type="spellEnd"/>
-      <w:r>
-        <w:t xml:space="preserve"> detects the presence of spoken words in a track. The more exclusively speech-like the recording (e.g. talk show, audio book, poetry), the closer to 1.0 the attribute value. Values above 0.66 describe tracks that are probably made entirely of spoken words. Values between 0.33 and 0.66 describe tracks that may contain both music and speech, either in sections or layered, including such cases as rap music. Values below 0.33 most likely represent music and other non-speech-like tracks.</w:t>
-      </w:r>
-    </w:p>
-    <w:p>
-      <w:pPr>
-        <w:pStyle w:val="NoSpacing"/>
-      </w:pPr>
-      <w:r>
-        <w:t>For all tracks: no preference</w:t>
-      </w:r>
-      <w:r>
-        <w:t xml:space="preserve">, exclude entirely spoken </w:t>
-      </w:r>
-      <w:proofErr w:type="spellStart"/>
-      <w:r>
-        <w:t>audiofiles</w:t>
-      </w:r>
-      <w:proofErr w:type="spellEnd"/>
-      <w:r>
-        <w:t xml:space="preserve"> (no music)</w:t>
-      </w:r>
-    </w:p>
-    <w:p/>
-    <w:p>
-      <w:pPr>
-        <w:rPr>
-          <w:rStyle w:val="Strong"/>
-        </w:rPr>
-      </w:pPr>
-      <w:proofErr w:type="spellStart"/>
-      <w:r>
-        <w:rPr>
-          <w:rStyle w:val="Strong"/>
-        </w:rPr>
-        <w:t>Time_signature</w:t>
-      </w:r>
-      <w:proofErr w:type="spellEnd"/>
-    </w:p>
-    <w:p>
-      <w:r>
-        <w:t xml:space="preserve">integer </w:t>
-      </w:r>
-    </w:p>
-    <w:p>
-      <w:r>
-        <w:t>An estimated time signature. The time signature (meter) is a notational convention to specify how many beats are in each bar (or measure). The time signature ranges from 3 to 7 indicating time signatures of "3/4", to "7/4".</w:t>
-      </w:r>
-    </w:p>
-    <w:p>
-      <w:pPr>
-        <w:pStyle w:val="NoSpacing"/>
-      </w:pPr>
-      <w:r>
-        <w:t>For all tracks: no preference</w:t>
-      </w:r>
-      <w:r>
-        <w:t>, depending on whether on-set not defined</w:t>
+        <w:t>For all tracks: no preference, depending on whether on-set not defined</w:t>
       </w:r>
     </w:p>
     <w:p/>
@@ -1581,6 +1553,7 @@
   <w:style w:type="character" w:default="1" w:styleId="DefaultParagraphFont">
     <w:name w:val="Default Paragraph Font"/>
     <w:uiPriority w:val="1"/>
+    <w:semiHidden/>
     <w:unhideWhenUsed/>
   </w:style>
   <w:style w:type="table" w:default="1" w:styleId="TableNormal">

</xml_diff>